<commit_message>
Update documents ( AI Usage, Change log, Task list)
</commit_message>
<xml_diff>
--- a/docs/phase4/ai-usage.docx
+++ b/docs/phase4/ai-usage.docx
@@ -1,6 +1,6 @@
 
 <file path=word/document.xml><?xml version="1.0" encoding="utf-8"?>
-<w:document xmlns:wpc="http://schemas.microsoft.com/office/word/2010/wordprocessingCanvas" xmlns:cx="http://schemas.microsoft.com/office/drawing/2014/chartex" xmlns:cx1="http://schemas.microsoft.com/office/drawing/2015/9/8/chartex" xmlns:cx2="http://schemas.microsoft.com/office/drawing/2015/10/21/chartex" xmlns:cx3="http://schemas.microsoft.com/office/drawing/2016/5/9/chartex" xmlns:cx4="http://schemas.microsoft.com/office/drawing/2016/5/10/chartex" xmlns:cx5="http://schemas.microsoft.com/office/drawing/2016/5/11/chartex" xmlns:cx6="http://schemas.microsoft.com/office/drawing/2016/5/12/chartex" xmlns:cx7="http://schemas.microsoft.com/office/drawing/2016/5/13/chartex" xmlns:cx8="http://schemas.microsoft.com/office/drawing/2016/5/14/chartex" xmlns:mc="http://schemas.openxmlformats.org/markup-compatibility/2006" xmlns:aink="http://schemas.microsoft.com/office/drawing/2016/ink" xmlns:am3d="http://schemas.microsoft.com/office/drawing/2017/model3d" xmlns:o="urn:schemas-microsoft-com:office:office" xmlns:oel="http://schemas.microsoft.com/office/2019/extlst" xmlns:r="http://schemas.openxmlformats.org/officeDocument/2006/relationships" xmlns:m="http://schemas.openxmlformats.org/officeDocument/2006/math" xmlns:v="urn:schemas-microsoft-com:vml" xmlns:wp14="http://schemas.microsoft.com/office/word/2010/wordprocessingDrawing" xmlns:wp="http://schemas.openxmlformats.org/drawingml/2006/wordprocessingDrawing" xmlns:w10="urn:schemas-microsoft-com:office:word" xmlns:w="http://schemas.openxmlformats.org/wordprocessingml/2006/main" xmlns:w14="http://schemas.microsoft.com/office/word/2010/wordml" xmlns:w15="http://schemas.microsoft.com/office/word/2012/wordml" xmlns:w16cex="http://schemas.microsoft.com/office/word/2018/wordml/cex" xmlns:w16cid="http://schemas.microsoft.com/office/word/2016/wordml/cid" xmlns:w16="http://schemas.microsoft.com/office/word/2018/wordml" xmlns:w16du="http://schemas.microsoft.com/office/word/2023/wordml/word16du" xmlns:w16sdtdh="http://schemas.microsoft.com/office/word/2020/wordml/sdtdatahash" xmlns:w16sdtfl="http://schemas.microsoft.com/office/word/2024/wordml/sdtformatlock" xmlns:w16se="http://schemas.microsoft.com/office/word/2015/wordml/symex" xmlns:wpg="http://schemas.microsoft.com/office/word/2010/wordprocessingGroup" xmlns:wpi="http://schemas.microsoft.com/office/word/2010/wordprocessingInk" xmlns:wne="http://schemas.microsoft.com/office/word/2006/wordml" xmlns:wps="http://schemas.microsoft.com/office/word/2010/wordprocessingShape" mc:Ignorable="w14 w15 w16se w16cid w16 w16cex w16sdtdh w16sdtfl w16du wp14">
+<w:document xmlns:wpc="http://schemas.microsoft.com/office/word/2010/wordprocessingCanvas" xmlns:cx="http://schemas.microsoft.com/office/drawing/2014/chartex" xmlns:cx1="http://schemas.microsoft.com/office/drawing/2015/9/8/chartex" xmlns:cx2="http://schemas.microsoft.com/office/drawing/2015/10/21/chartex" xmlns:cx3="http://schemas.microsoft.com/office/drawing/2016/5/9/chartex" xmlns:cx4="http://schemas.microsoft.com/office/drawing/2016/5/10/chartex" xmlns:cx5="http://schemas.microsoft.com/office/drawing/2016/5/11/chartex" xmlns:cx6="http://schemas.microsoft.com/office/drawing/2016/5/12/chartex" xmlns:cx7="http://schemas.microsoft.com/office/drawing/2016/5/13/chartex" xmlns:cx8="http://schemas.microsoft.com/office/drawing/2016/5/14/chartex" xmlns:mc="http://schemas.openxmlformats.org/markup-compatibility/2006" xmlns:aink="http://schemas.microsoft.com/office/drawing/2016/ink" xmlns:am3d="http://schemas.microsoft.com/office/drawing/2017/model3d" xmlns:o="urn:schemas-microsoft-com:office:office" xmlns:oel="http://schemas.microsoft.com/office/2019/extlst" xmlns:r="http://schemas.openxmlformats.org/officeDocument/2006/relationships" xmlns:m="http://schemas.openxmlformats.org/officeDocument/2006/math" xmlns:v="urn:schemas-microsoft-com:vml" xmlns:wp14="http://schemas.microsoft.com/office/word/2010/wordprocessingDrawing" xmlns:wp="http://schemas.openxmlformats.org/drawingml/2006/wordprocessingDrawing" xmlns:w10="urn:schemas-microsoft-com:office:word" xmlns:w="http://schemas.openxmlformats.org/wordprocessingml/2006/main" xmlns:w14="http://schemas.microsoft.com/office/word/2010/wordml" xmlns:w15="http://schemas.microsoft.com/office/word/2012/wordml" xmlns:w16cex="http://schemas.microsoft.com/office/word/2018/wordml/cex" xmlns:w16cid="http://schemas.microsoft.com/office/word/2016/wordml/cid" xmlns:w16="http://schemas.microsoft.com/office/word/2018/wordml" xmlns:w16du="http://schemas.microsoft.com/office/word/2023/wordml/word16du" xmlns:w16sdtdh="http://schemas.microsoft.com/office/word/2020/wordml/sdtdatahash" xmlns:w16se="http://schemas.microsoft.com/office/word/2015/wordml/symex" xmlns:wpg="http://schemas.microsoft.com/office/word/2010/wordprocessingGroup" xmlns:wpi="http://schemas.microsoft.com/office/word/2010/wordprocessingInk" xmlns:wne="http://schemas.microsoft.com/office/word/2006/wordml" xmlns:wps="http://schemas.microsoft.com/office/word/2010/wordprocessingShape" mc:Ignorable="w14 w15 w16se w16cid w16 w16cex w16sdtdh w16du wp14">
   <w:body>
     <w:p>
       <w:pPr>
@@ -387,21 +387,7 @@
               <w:rPr>
                 <w:rFonts w:ascii="Times New Roman" w:hAnsi="Times New Roman" w:cs="Times New Roman"/>
               </w:rPr>
-              <w:t xml:space="preserve">I used AI to help me write the budget </w:t>
-            </w:r>
-            <w:proofErr w:type="spellStart"/>
-            <w:r>
-              <w:rPr>
-                <w:rFonts w:ascii="Times New Roman" w:hAnsi="Times New Roman" w:cs="Times New Roman"/>
-              </w:rPr>
-              <w:t>js</w:t>
-            </w:r>
-            <w:proofErr w:type="spellEnd"/>
-            <w:r>
-              <w:rPr>
-                <w:rFonts w:ascii="Times New Roman" w:hAnsi="Times New Roman" w:cs="Times New Roman"/>
-              </w:rPr>
-              <w:t xml:space="preserve"> file and help with creating the program for DB. I used it for debugging when the program would not run and see what suggestions AI would have to fix the problems.</w:t>
+              <w:t>I used AI to help me write the budget js file and help with creating the program for DB. I used it for debugging when the program would not run and see what suggestions AI would have to fix the problems.</w:t>
             </w:r>
           </w:p>
         </w:tc>
@@ -430,28 +416,12 @@
                 <w:rFonts w:ascii="Times New Roman" w:hAnsi="Times New Roman" w:cs="Times New Roman"/>
               </w:rPr>
             </w:pPr>
-            <w:proofErr w:type="spellStart"/>
             <w:r>
               <w:rPr>
                 <w:rFonts w:ascii="Times New Roman" w:eastAsia="Aptos" w:hAnsi="Times New Roman" w:cs="Times New Roman"/>
               </w:rPr>
-              <w:t>Roumaysae</w:t>
+              <w:t>Roumaysae Jerari</w:t>
             </w:r>
-            <w:proofErr w:type="spellEnd"/>
-            <w:r>
-              <w:rPr>
-                <w:rFonts w:ascii="Times New Roman" w:eastAsia="Aptos" w:hAnsi="Times New Roman" w:cs="Times New Roman"/>
-              </w:rPr>
-              <w:t xml:space="preserve"> </w:t>
-            </w:r>
-            <w:proofErr w:type="spellStart"/>
-            <w:r>
-              <w:rPr>
-                <w:rFonts w:ascii="Times New Roman" w:eastAsia="Aptos" w:hAnsi="Times New Roman" w:cs="Times New Roman"/>
-              </w:rPr>
-              <w:t>Jerari</w:t>
-            </w:r>
-            <w:proofErr w:type="spellEnd"/>
           </w:p>
         </w:tc>
         <w:tc>
@@ -487,6 +457,19 @@
           <w:tcPr>
             <w:tcW w:w="6841" w:type="dxa"/>
           </w:tcPr>
+          <w:p>
+            <w:pPr>
+              <w:shd w:val="clear" w:color="auto" w:fill="FFFFFF"/>
+              <w:suppressAutoHyphens w:val="0"/>
+              <w:spacing w:after="240" w:line="480" w:lineRule="auto"/>
+              <w:rPr>
+                <w:rFonts w:ascii="Times New Roman" w:eastAsia="Times New Roman" w:hAnsi="Times New Roman" w:cs="Times New Roman"/>
+                <w:color w:val="0F1115"/>
+                <w:kern w:val="0"/>
+                <w14:ligatures w14:val="none"/>
+              </w:rPr>
+            </w:pPr>
+          </w:p>
           <w:p>
             <w:pPr>
               <w:shd w:val="clear" w:color="auto" w:fill="FFFFFF"/>
@@ -533,27 +516,7 @@
                 <w14:ligatures w14:val="none"/>
               </w:rPr>
               <w:lastRenderedPageBreak/>
-              <w:t xml:space="preserve">Expanded </w:t>
-            </w:r>
-            <w:proofErr w:type="spellStart"/>
-            <w:r>
-              <w:rPr>
-                <w:rFonts w:ascii="Times New Roman" w:eastAsia="Times New Roman" w:hAnsi="Times New Roman" w:cs="Times New Roman"/>
-                <w:color w:val="0F1115"/>
-                <w:kern w:val="0"/>
-                <w14:ligatures w14:val="none"/>
-              </w:rPr>
-              <w:t>Veryfi</w:t>
-            </w:r>
-            <w:proofErr w:type="spellEnd"/>
-            <w:r>
-              <w:rPr>
-                <w:rFonts w:ascii="Times New Roman" w:eastAsia="Times New Roman" w:hAnsi="Times New Roman" w:cs="Times New Roman"/>
-                <w:color w:val="0F1115"/>
-                <w:kern w:val="0"/>
-                <w14:ligatures w14:val="none"/>
-              </w:rPr>
-              <w:t xml:space="preserve"> category mapping for automatic receipt categorization.</w:t>
+              <w:t>Expanded Veryfi category mapping for automatic receipt categorization.</w:t>
             </w:r>
           </w:p>
           <w:p>
@@ -731,7 +694,7 @@
 </file>
 
 <file path=word/numbering.xml><?xml version="1.0" encoding="utf-8"?>
-<w:numbering xmlns:wpc="http://schemas.microsoft.com/office/word/2010/wordprocessingCanvas" xmlns:cx="http://schemas.microsoft.com/office/drawing/2014/chartex" xmlns:cx1="http://schemas.microsoft.com/office/drawing/2015/9/8/chartex" xmlns:cx2="http://schemas.microsoft.com/office/drawing/2015/10/21/chartex" xmlns:cx3="http://schemas.microsoft.com/office/drawing/2016/5/9/chartex" xmlns:cx4="http://schemas.microsoft.com/office/drawing/2016/5/10/chartex" xmlns:cx5="http://schemas.microsoft.com/office/drawing/2016/5/11/chartex" xmlns:cx6="http://schemas.microsoft.com/office/drawing/2016/5/12/chartex" xmlns:cx7="http://schemas.microsoft.com/office/drawing/2016/5/13/chartex" xmlns:cx8="http://schemas.microsoft.com/office/drawing/2016/5/14/chartex" xmlns:mc="http://schemas.openxmlformats.org/markup-compatibility/2006" xmlns:aink="http://schemas.microsoft.com/office/drawing/2016/ink" xmlns:am3d="http://schemas.microsoft.com/office/drawing/2017/model3d" xmlns:o="urn:schemas-microsoft-com:office:office" xmlns:oel="http://schemas.microsoft.com/office/2019/extlst" xmlns:r="http://schemas.openxmlformats.org/officeDocument/2006/relationships" xmlns:m="http://schemas.openxmlformats.org/officeDocument/2006/math" xmlns:v="urn:schemas-microsoft-com:vml" xmlns:wp14="http://schemas.microsoft.com/office/word/2010/wordprocessingDrawing" xmlns:wp="http://schemas.openxmlformats.org/drawingml/2006/wordprocessingDrawing" xmlns:w10="urn:schemas-microsoft-com:office:word" xmlns:w="http://schemas.openxmlformats.org/wordprocessingml/2006/main" xmlns:w14="http://schemas.microsoft.com/office/word/2010/wordml" xmlns:w15="http://schemas.microsoft.com/office/word/2012/wordml" xmlns:w16cex="http://schemas.microsoft.com/office/word/2018/wordml/cex" xmlns:w16cid="http://schemas.microsoft.com/office/word/2016/wordml/cid" xmlns:w16="http://schemas.microsoft.com/office/word/2018/wordml" xmlns:w16du="http://schemas.microsoft.com/office/word/2023/wordml/word16du" xmlns:w16sdtdh="http://schemas.microsoft.com/office/word/2020/wordml/sdtdatahash" xmlns:w16sdtfl="http://schemas.microsoft.com/office/word/2024/wordml/sdtformatlock" xmlns:w16se="http://schemas.microsoft.com/office/word/2015/wordml/symex" xmlns:wpg="http://schemas.microsoft.com/office/word/2010/wordprocessingGroup" xmlns:wpi="http://schemas.microsoft.com/office/word/2010/wordprocessingInk" xmlns:wne="http://schemas.microsoft.com/office/word/2006/wordml" xmlns:wps="http://schemas.microsoft.com/office/word/2010/wordprocessingShape" mc:Ignorable="w14 w15 w16se w16cid w16 w16cex w16sdtdh w16sdtfl w16du wp14">
+<w:numbering xmlns:wpc="http://schemas.microsoft.com/office/word/2010/wordprocessingCanvas" xmlns:cx="http://schemas.microsoft.com/office/drawing/2014/chartex" xmlns:cx1="http://schemas.microsoft.com/office/drawing/2015/9/8/chartex" xmlns:cx2="http://schemas.microsoft.com/office/drawing/2015/10/21/chartex" xmlns:cx3="http://schemas.microsoft.com/office/drawing/2016/5/9/chartex" xmlns:cx4="http://schemas.microsoft.com/office/drawing/2016/5/10/chartex" xmlns:cx5="http://schemas.microsoft.com/office/drawing/2016/5/11/chartex" xmlns:cx6="http://schemas.microsoft.com/office/drawing/2016/5/12/chartex" xmlns:cx7="http://schemas.microsoft.com/office/drawing/2016/5/13/chartex" xmlns:cx8="http://schemas.microsoft.com/office/drawing/2016/5/14/chartex" xmlns:mc="http://schemas.openxmlformats.org/markup-compatibility/2006" xmlns:aink="http://schemas.microsoft.com/office/drawing/2016/ink" xmlns:am3d="http://schemas.microsoft.com/office/drawing/2017/model3d" xmlns:o="urn:schemas-microsoft-com:office:office" xmlns:oel="http://schemas.microsoft.com/office/2019/extlst" xmlns:r="http://schemas.openxmlformats.org/officeDocument/2006/relationships" xmlns:m="http://schemas.openxmlformats.org/officeDocument/2006/math" xmlns:v="urn:schemas-microsoft-com:vml" xmlns:wp14="http://schemas.microsoft.com/office/word/2010/wordprocessingDrawing" xmlns:wp="http://schemas.openxmlformats.org/drawingml/2006/wordprocessingDrawing" xmlns:w10="urn:schemas-microsoft-com:office:word" xmlns:w="http://schemas.openxmlformats.org/wordprocessingml/2006/main" xmlns:w14="http://schemas.microsoft.com/office/word/2010/wordml" xmlns:w15="http://schemas.microsoft.com/office/word/2012/wordml" xmlns:w16cex="http://schemas.microsoft.com/office/word/2018/wordml/cex" xmlns:w16cid="http://schemas.microsoft.com/office/word/2016/wordml/cid" xmlns:w16="http://schemas.microsoft.com/office/word/2018/wordml" xmlns:w16du="http://schemas.microsoft.com/office/word/2023/wordml/word16du" xmlns:w16sdtdh="http://schemas.microsoft.com/office/word/2020/wordml/sdtdatahash" xmlns:w16se="http://schemas.microsoft.com/office/word/2015/wordml/symex" xmlns:wpg="http://schemas.microsoft.com/office/word/2010/wordprocessingGroup" xmlns:wpi="http://schemas.microsoft.com/office/word/2010/wordprocessingInk" xmlns:wne="http://schemas.microsoft.com/office/word/2006/wordml" xmlns:wps="http://schemas.microsoft.com/office/word/2010/wordprocessingShape" mc:Ignorable="w14 w15 w16se w16cid w16 w16cex w16sdtdh w16du wp14">
   <w:abstractNum w:abstractNumId="0" w15:restartNumberingAfterBreak="0">
     <w:nsid w:val="3D1A6092"/>
     <w:multiLevelType w:val="multilevel"/>
@@ -1013,7 +976,7 @@
 </file>
 
 <file path=word/styles.xml><?xml version="1.0" encoding="utf-8"?>
-<w:styles xmlns:mc="http://schemas.openxmlformats.org/markup-compatibility/2006" xmlns:r="http://schemas.openxmlformats.org/officeDocument/2006/relationships" xmlns:w="http://schemas.openxmlformats.org/wordprocessingml/2006/main" xmlns:w14="http://schemas.microsoft.com/office/word/2010/wordml" xmlns:w15="http://schemas.microsoft.com/office/word/2012/wordml" xmlns:w16cex="http://schemas.microsoft.com/office/word/2018/wordml/cex" xmlns:w16cid="http://schemas.microsoft.com/office/word/2016/wordml/cid" xmlns:w16="http://schemas.microsoft.com/office/word/2018/wordml" xmlns:w16du="http://schemas.microsoft.com/office/word/2023/wordml/word16du" xmlns:w16sdtdh="http://schemas.microsoft.com/office/word/2020/wordml/sdtdatahash" xmlns:w16sdtfl="http://schemas.microsoft.com/office/word/2024/wordml/sdtformatlock" xmlns:w16se="http://schemas.microsoft.com/office/word/2015/wordml/symex" mc:Ignorable="w14 w15 w16se w16cid w16 w16cex w16sdtdh w16sdtfl w16du">
+<w:styles xmlns:mc="http://schemas.openxmlformats.org/markup-compatibility/2006" xmlns:r="http://schemas.openxmlformats.org/officeDocument/2006/relationships" xmlns:w="http://schemas.openxmlformats.org/wordprocessingml/2006/main" xmlns:w14="http://schemas.microsoft.com/office/word/2010/wordml" xmlns:w15="http://schemas.microsoft.com/office/word/2012/wordml" xmlns:w16cex="http://schemas.microsoft.com/office/word/2018/wordml/cex" xmlns:w16cid="http://schemas.microsoft.com/office/word/2016/wordml/cid" xmlns:w16="http://schemas.microsoft.com/office/word/2018/wordml" xmlns:w16du="http://schemas.microsoft.com/office/word/2023/wordml/word16du" xmlns:w16sdtdh="http://schemas.microsoft.com/office/word/2020/wordml/sdtdatahash" xmlns:w16se="http://schemas.microsoft.com/office/word/2015/wordml/symex" mc:Ignorable="w14 w15 w16se w16cid w16 w16cex w16sdtdh w16du">
   <w:docDefaults>
     <w:rPrDefault>
       <w:rPr>

</xml_diff>